<commit_message>
docs: atualizar documentação completa para tag v2
- PPTX/DOCX regenerados com: ES 7.17.24, Langfuse 2.x, ProxyLLM, 6 e2e
- Slide 1: versão 2; slide 15: título inclui 6 E2E; slide 17: KPI "6 testes e2e"
- DOCX: tabela de serviços com ProxyLLM + notas de compatibilidade ES/Langfuse
- DOCX: métricas com 6 e2e validados; Makefile com make test-e2e e make proxy
- CLAUDE.md e README-bootstrap.md já atualizados na sessão anterior
</commit_message>
<xml_diff>
--- a/docs/fhir-forge-arquitetura.docx
+++ b/docs/fhir-forge-arquitetura.docx
@@ -318,7 +318,7 @@
                 <w:rFonts w:ascii="Calibri" w:hAnsi="Calibri"/>
                 <w:sz w:val="20"/>
               </w:rPr>
-              <w:t>9/9 fases completas — 252 testes, 91% cobertura</w:t>
+              <w:t>9/9 fases completas — 252 unit + 6 e2e, 91% cobertura — tag v2</w:t>
             </w:r>
           </w:p>
         </w:tc>
@@ -5966,7 +5966,7 @@
                 <w:rFonts w:ascii="Calibri" w:hAnsi="Calibri"/>
                 <w:sz w:val="20"/>
               </w:rPr>
-              <w:t>elasticsearch:8.11.1</w:t>
+              <w:t>elasticsearch:7.17.24</w:t>
             </w:r>
           </w:p>
         </w:tc>
@@ -5996,7 +5996,7 @@
                 <w:rFonts w:ascii="Calibri" w:hAnsi="Calibri"/>
                 <w:sz w:val="20"/>
               </w:rPr>
-              <w:t>Backend de índice do Snowstorm (obrigatório)</w:t>
+              <w:t>Backend de índice do Snowstorm — ES 7.x (Snowstorm 7.x usa RestHighLevelClient ES 7)</w:t>
             </w:r>
           </w:p>
         </w:tc>
@@ -6199,7 +6199,7 @@
                 <w:rFonts w:ascii="Calibri" w:hAnsi="Calibri"/>
                 <w:sz w:val="20"/>
               </w:rPr>
-              <w:t>Langfuse 3.x</w:t>
+              <w:t>Langfuse 2.x</w:t>
             </w:r>
           </w:p>
         </w:tc>
@@ -6214,7 +6214,7 @@
                 <w:rFonts w:ascii="Calibri" w:hAnsi="Calibri"/>
                 <w:sz w:val="20"/>
               </w:rPr>
-              <w:t>langfuse/langfuse:3</w:t>
+              <w:t>langfuse/langfuse:2</w:t>
             </w:r>
           </w:p>
         </w:tc>
@@ -6244,7 +6244,7 @@
                 <w:rFonts w:ascii="Calibri" w:hAnsi="Calibri"/>
                 <w:sz w:val="20"/>
               </w:rPr>
-              <w:t>Observabilidade de LLMs — traces, métricas</w:t>
+              <w:t>Observabilidade de LLMs — Langfuse 2.x (v3 requer ClickHouse)</w:t>
             </w:r>
           </w:p>
         </w:tc>
@@ -6261,7 +6261,7 @@
                 <w:rFonts w:ascii="Calibri" w:hAnsi="Calibri"/>
                 <w:sz w:val="20"/>
               </w:rPr>
-              <w:t>FastAPI App</w:t>
+              <w:t>ProxyLLM</w:t>
             </w:r>
           </w:p>
         </w:tc>
@@ -6291,7 +6291,7 @@
                 <w:rFonts w:ascii="Calibri" w:hAnsi="Calibri"/>
                 <w:sz w:val="20"/>
               </w:rPr>
-              <w:t>8000</w:t>
+              <w:t>9099</w:t>
             </w:r>
           </w:p>
         </w:tc>
@@ -6306,7 +6306,7 @@
                 <w:rFonts w:ascii="Calibri" w:hAnsi="Calibri"/>
                 <w:sz w:val="20"/>
               </w:rPr>
-              <w:t>Gateway REST — /convert, /health, /fhir, /mcp</w:t>
+              <w:t>Proxy /v1/messages para dev sem API key — roteia para Ollama ou mock FHIR</w:t>
             </w:r>
           </w:p>
         </w:tc>
@@ -6323,7 +6323,7 @@
                 <w:rFonts w:ascii="Calibri" w:hAnsi="Calibri"/>
                 <w:sz w:val="20"/>
               </w:rPr>
-              <w:t>Dramatiq</w:t>
+              <w:t>FastAPI App</w:t>
             </w:r>
           </w:p>
         </w:tc>
@@ -6338,7 +6338,7 @@
                 <w:rFonts w:ascii="Calibri" w:hAnsi="Calibri"/>
                 <w:sz w:val="20"/>
               </w:rPr>
-              <w:t>(local)</w:t>
+              <w:t>(local build)</w:t>
             </w:r>
           </w:p>
         </w:tc>
@@ -6353,7 +6353,7 @@
                 <w:rFonts w:ascii="Calibri" w:hAnsi="Calibri"/>
                 <w:sz w:val="20"/>
               </w:rPr>
-              <w:t>—</w:t>
+              <w:t>8000</w:t>
             </w:r>
           </w:p>
         </w:tc>
@@ -6361,6 +6361,68 @@
           <w:tcPr>
             <w:tcW w:type="dxa" w:w="6048"/>
             <w:shd w:val="clear" w:color="auto" w:fill="F0F4FA"/>
+          </w:tcPr>
+          <w:p>
+            <w:r>
+              <w:rPr>
+                <w:rFonts w:ascii="Calibri" w:hAnsi="Calibri"/>
+                <w:sz w:val="20"/>
+              </w:rPr>
+              <w:t>Gateway REST — /convert, /health, /fhir, /mcp</w:t>
+            </w:r>
+          </w:p>
+        </w:tc>
+      </w:tr>
+      <w:tr>
+        <w:tc>
+          <w:tcPr>
+            <w:tcW w:type="dxa" w:w="2592"/>
+            <w:shd w:val="clear" w:color="auto" w:fill="FFFFFF"/>
+          </w:tcPr>
+          <w:p>
+            <w:r>
+              <w:rPr>
+                <w:rFonts w:ascii="Calibri" w:hAnsi="Calibri"/>
+                <w:sz w:val="20"/>
+              </w:rPr>
+              <w:t>Dramatiq</w:t>
+            </w:r>
+          </w:p>
+        </w:tc>
+        <w:tc>
+          <w:tcPr>
+            <w:tcW w:type="dxa" w:w="3600"/>
+            <w:shd w:val="clear" w:color="auto" w:fill="FFFFFF"/>
+          </w:tcPr>
+          <w:p>
+            <w:r>
+              <w:rPr>
+                <w:rFonts w:ascii="Calibri" w:hAnsi="Calibri"/>
+                <w:sz w:val="20"/>
+              </w:rPr>
+              <w:t>(local)</w:t>
+            </w:r>
+          </w:p>
+        </w:tc>
+        <w:tc>
+          <w:tcPr>
+            <w:tcW w:type="dxa" w:w="1440"/>
+            <w:shd w:val="clear" w:color="auto" w:fill="FFFFFF"/>
+          </w:tcPr>
+          <w:p>
+            <w:r>
+              <w:rPr>
+                <w:rFonts w:ascii="Calibri" w:hAnsi="Calibri"/>
+                <w:sz w:val="20"/>
+              </w:rPr>
+              <w:t>—</w:t>
+            </w:r>
+          </w:p>
+        </w:tc>
+        <w:tc>
+          <w:tcPr>
+            <w:tcW w:type="dxa" w:w="6048"/>
+            <w:shd w:val="clear" w:color="auto" w:fill="FFFFFF"/>
           </w:tcPr>
           <w:p>
             <w:r>
@@ -9148,7 +9210,7 @@
                 <w:rFonts w:ascii="Calibri" w:hAnsi="Calibri"/>
                 <w:sz w:val="20"/>
               </w:rPr>
-              <w:t>Docker stack completa, curl, pytest</w:t>
+              <w:t>Anthropic API real + HAPI real (6 testes validados)</w:t>
             </w:r>
           </w:p>
         </w:tc>
@@ -9320,7 +9382,7 @@
         <w:pStyle w:val="Heading2"/>
       </w:pPr>
       <w:r>
-        <w:t>13.3 Métricas Atuais (Abril 2026)</w:t>
+        <w:t>13.3 Métricas Atuais (tag v2, Abril 2026)</w:t>
       </w:r>
     </w:p>
     <w:tbl>
@@ -9413,7 +9475,7 @@
                 <w:rFonts w:ascii="Calibri" w:hAnsi="Calibri"/>
                 <w:sz w:val="20"/>
               </w:rPr>
-              <w:t>Cobertura de código</w:t>
+              <w:t>Testes e2e validados</w:t>
             </w:r>
           </w:p>
         </w:tc>
@@ -9428,7 +9490,7 @@
                 <w:rFonts w:ascii="Calibri" w:hAnsi="Calibri"/>
                 <w:sz w:val="20"/>
               </w:rPr>
-              <w:t>91%</w:t>
+              <w:t>6 (pipeline real Anthropic + HAPI)</w:t>
             </w:r>
           </w:p>
         </w:tc>
@@ -9445,7 +9507,7 @@
                 <w:rFonts w:ascii="Calibri" w:hAnsi="Calibri"/>
                 <w:sz w:val="20"/>
               </w:rPr>
-              <w:t>ruff check</w:t>
+              <w:t>Cobertura de código</w:t>
             </w:r>
           </w:p>
         </w:tc>
@@ -9460,7 +9522,7 @@
                 <w:rFonts w:ascii="Calibri" w:hAnsi="Calibri"/>
                 <w:sz w:val="20"/>
               </w:rPr>
-              <w:t>0 erros</w:t>
+              <w:t>91%</w:t>
             </w:r>
           </w:p>
         </w:tc>
@@ -9477,7 +9539,7 @@
                 <w:rFonts w:ascii="Calibri" w:hAnsi="Calibri"/>
                 <w:sz w:val="20"/>
               </w:rPr>
-              <w:t>mypy strict</w:t>
+              <w:t>ruff check</w:t>
             </w:r>
           </w:p>
         </w:tc>
@@ -9509,7 +9571,7 @@
                 <w:rFonts w:ascii="Calibri" w:hAnsi="Calibri"/>
                 <w:sz w:val="20"/>
               </w:rPr>
-              <w:t>Hipótese (hypothesis)</w:t>
+              <w:t>mypy strict</w:t>
             </w:r>
           </w:p>
         </w:tc>
@@ -9517,6 +9579,38 @@
           <w:tcPr>
             <w:tcW w:type="dxa" w:w="5760"/>
             <w:shd w:val="clear" w:color="auto" w:fill="F0F4FA"/>
+          </w:tcPr>
+          <w:p>
+            <w:r>
+              <w:rPr>
+                <w:rFonts w:ascii="Calibri" w:hAnsi="Calibri"/>
+                <w:sz w:val="20"/>
+              </w:rPr>
+              <w:t>0 erros</w:t>
+            </w:r>
+          </w:p>
+        </w:tc>
+      </w:tr>
+      <w:tr>
+        <w:tc>
+          <w:tcPr>
+            <w:tcW w:type="dxa" w:w="4320"/>
+            <w:shd w:val="clear" w:color="auto" w:fill="FFFFFF"/>
+          </w:tcPr>
+          <w:p>
+            <w:r>
+              <w:rPr>
+                <w:rFonts w:ascii="Calibri" w:hAnsi="Calibri"/>
+                <w:sz w:val="20"/>
+              </w:rPr>
+              <w:t>Hipótese (hypothesis)</w:t>
+            </w:r>
+          </w:p>
+        </w:tc>
+        <w:tc>
+          <w:tcPr>
+            <w:tcW w:type="dxa" w:w="5760"/>
+            <w:shd w:val="clear" w:color="auto" w:fill="FFFFFF"/>
           </w:tcPr>
           <w:p>
             <w:r>
@@ -10385,7 +10479,7 @@
                 <w:rFonts w:ascii="Calibri" w:hAnsi="Calibri"/>
                 <w:sz w:val="20"/>
               </w:rPr>
-              <w:t>make lint</w:t>
+              <w:t>make test-e2e</w:t>
             </w:r>
           </w:p>
         </w:tc>
@@ -10400,7 +10494,7 @@
                 <w:rFonts w:ascii="Calibri" w:hAnsi="Calibri"/>
                 <w:sz w:val="20"/>
               </w:rPr>
-              <w:t>ruff check + mypy strict</w:t>
+              <w:t>Testes e2e (stack up + ANTHROPIC_API_KEY)</w:t>
             </w:r>
           </w:p>
         </w:tc>
@@ -10417,7 +10511,7 @@
                 <w:rFonts w:ascii="Calibri" w:hAnsi="Calibri"/>
                 <w:sz w:val="20"/>
               </w:rPr>
-              <w:t>make fmt</w:t>
+              <w:t>make lint</w:t>
             </w:r>
           </w:p>
         </w:tc>
@@ -10432,7 +10526,7 @@
                 <w:rFonts w:ascii="Calibri" w:hAnsi="Calibri"/>
                 <w:sz w:val="20"/>
               </w:rPr>
-              <w:t>ruff format + fix automático</w:t>
+              <w:t>ruff check + mypy strict</w:t>
             </w:r>
           </w:p>
         </w:tc>
@@ -10449,7 +10543,7 @@
                 <w:rFonts w:ascii="Calibri" w:hAnsi="Calibri"/>
                 <w:sz w:val="20"/>
               </w:rPr>
-              <w:t>make api</w:t>
+              <w:t>make fmt</w:t>
             </w:r>
           </w:p>
         </w:tc>
@@ -10464,7 +10558,7 @@
                 <w:rFonts w:ascii="Calibri" w:hAnsi="Calibri"/>
                 <w:sz w:val="20"/>
               </w:rPr>
-              <w:t>FastAPI em modo dev (reload)</w:t>
+              <w:t>ruff format + fix automático</w:t>
             </w:r>
           </w:p>
         </w:tc>
@@ -10481,7 +10575,7 @@
                 <w:rFonts w:ascii="Calibri" w:hAnsi="Calibri"/>
                 <w:sz w:val="20"/>
               </w:rPr>
-              <w:t>make worker</w:t>
+              <w:t>make api</w:t>
             </w:r>
           </w:p>
         </w:tc>
@@ -10496,7 +10590,71 @@
                 <w:rFonts w:ascii="Calibri" w:hAnsi="Calibri"/>
                 <w:sz w:val="20"/>
               </w:rPr>
+              <w:t>FastAPI em modo dev (reload)</w:t>
+            </w:r>
+          </w:p>
+        </w:tc>
+      </w:tr>
+      <w:tr>
+        <w:tc>
+          <w:tcPr>
+            <w:tcW w:type="dxa" w:w="3168"/>
+            <w:shd w:val="clear" w:color="auto" w:fill="FFFFFF"/>
+          </w:tcPr>
+          <w:p>
+            <w:r>
+              <w:rPr>
+                <w:rFonts w:ascii="Calibri" w:hAnsi="Calibri"/>
+                <w:sz w:val="20"/>
+              </w:rPr>
+              <w:t>make worker</w:t>
+            </w:r>
+          </w:p>
+        </w:tc>
+        <w:tc>
+          <w:tcPr>
+            <w:tcW w:type="dxa" w:w="9072"/>
+            <w:shd w:val="clear" w:color="auto" w:fill="FFFFFF"/>
+          </w:tcPr>
+          <w:p>
+            <w:r>
+              <w:rPr>
+                <w:rFonts w:ascii="Calibri" w:hAnsi="Calibri"/>
+                <w:sz w:val="20"/>
+              </w:rPr>
               <w:t>Dramatiq worker</w:t>
+            </w:r>
+          </w:p>
+        </w:tc>
+      </w:tr>
+      <w:tr>
+        <w:tc>
+          <w:tcPr>
+            <w:tcW w:type="dxa" w:w="3168"/>
+            <w:shd w:val="clear" w:color="auto" w:fill="F0F4FA"/>
+          </w:tcPr>
+          <w:p>
+            <w:r>
+              <w:rPr>
+                <w:rFonts w:ascii="Calibri" w:hAnsi="Calibri"/>
+                <w:sz w:val="20"/>
+              </w:rPr>
+              <w:t>make proxy</w:t>
+            </w:r>
+          </w:p>
+        </w:tc>
+        <w:tc>
+          <w:tcPr>
+            <w:tcW w:type="dxa" w:w="9072"/>
+            <w:shd w:val="clear" w:color="auto" w:fill="F0F4FA"/>
+          </w:tcPr>
+          <w:p>
+            <w:r>
+              <w:rPr>
+                <w:rFonts w:ascii="Calibri" w:hAnsi="Calibri"/>
+                <w:sz w:val="20"/>
+              </w:rPr>
+              <w:t>ProxyLLM local (porta 9099) — dev sem API key</w:t>
             </w:r>
           </w:p>
         </w:tc>
@@ -11329,7 +11487,7 @@
                 <w:rFonts w:ascii="Calibri" w:hAnsi="Calibri"/>
                 <w:sz w:val="20"/>
               </w:rPr>
-              <w:t>3.0</w:t>
+              <w:t>2.x</w:t>
             </w:r>
           </w:p>
         </w:tc>
@@ -11344,7 +11502,7 @@
                 <w:rFonts w:ascii="Calibri" w:hAnsi="Calibri"/>
                 <w:sz w:val="20"/>
               </w:rPr>
-              <w:t>Rastreamento de chamadas LLM</w:t>
+              <w:t>Rastreamento de chamadas LLM (v3 requer ClickHouse)</w:t>
             </w:r>
           </w:p>
         </w:tc>

</xml_diff>

<commit_message>
docs: regenerate PPTX/DOCX architecture for v2.1
Update generator scripts (footer, KPIs, metrics tables,
status row) for v2.1 baseline:
- 252 -> 289 unit tests
- add 'integration' KPI (3 tests via testcontainer)
- 'tag v2' -> 'tag v2.1' in title cells

Regenerate the two binary artifacts.

Co-Authored-By: Claude Opus 4.7 <noreply@anthropic.com>
</commit_message>
<xml_diff>
--- a/docs/fhir-forge-arquitetura.docx
+++ b/docs/fhir-forge-arquitetura.docx
@@ -318,7 +318,7 @@
                 <w:rFonts w:ascii="Calibri" w:hAnsi="Calibri"/>
                 <w:sz w:val="20"/>
               </w:rPr>
-              <w:t>9/9 fases completas — 252 unit + 6 e2e, 91% cobertura — tag v2</w:t>
+              <w:t>9/9 fases completas — 289 unit + 3 integration + 7 regression + 6 e2e, 91% cobertura — tag v2.1</w:t>
             </w:r>
           </w:p>
         </w:tc>
@@ -9382,7 +9382,7 @@
         <w:pStyle w:val="Heading2"/>
       </w:pPr>
       <w:r>
-        <w:t>13.3 Métricas Atuais (tag v2, Abril 2026)</w:t>
+        <w:t>13.3 Métricas Atuais (tag v2.1, Abril 2026)</w:t>
       </w:r>
     </w:p>
     <w:tbl>
@@ -9458,7 +9458,71 @@
                 <w:rFonts w:ascii="Calibri" w:hAnsi="Calibri"/>
                 <w:sz w:val="20"/>
               </w:rPr>
-              <w:t>252</w:t>
+              <w:t>289</w:t>
+            </w:r>
+          </w:p>
+        </w:tc>
+      </w:tr>
+      <w:tr>
+        <w:tc>
+          <w:tcPr>
+            <w:tcW w:type="dxa" w:w="4320"/>
+            <w:shd w:val="clear" w:color="auto" w:fill="FFFFFF"/>
+          </w:tcPr>
+          <w:p>
+            <w:r>
+              <w:rPr>
+                <w:rFonts w:ascii="Calibri" w:hAnsi="Calibri"/>
+                <w:sz w:val="20"/>
+              </w:rPr>
+              <w:t>Testes integration (HAPI testcontainer)</w:t>
+            </w:r>
+          </w:p>
+        </w:tc>
+        <w:tc>
+          <w:tcPr>
+            <w:tcW w:type="dxa" w:w="5760"/>
+            <w:shd w:val="clear" w:color="auto" w:fill="FFFFFF"/>
+          </w:tcPr>
+          <w:p>
+            <w:r>
+              <w:rPr>
+                <w:rFonts w:ascii="Calibri" w:hAnsi="Calibri"/>
+                <w:sz w:val="20"/>
+              </w:rPr>
+              <w:t>3 (Bundle/$validate sem fatais nem dom-6)</w:t>
+            </w:r>
+          </w:p>
+        </w:tc>
+      </w:tr>
+      <w:tr>
+        <w:tc>
+          <w:tcPr>
+            <w:tcW w:type="dxa" w:w="4320"/>
+            <w:shd w:val="clear" w:color="auto" w:fill="F0F4FA"/>
+          </w:tcPr>
+          <w:p>
+            <w:r>
+              <w:rPr>
+                <w:rFonts w:ascii="Calibri" w:hAnsi="Calibri"/>
+                <w:sz w:val="20"/>
+              </w:rPr>
+              <w:t>Testes regression</w:t>
+            </w:r>
+          </w:p>
+        </w:tc>
+        <w:tc>
+          <w:tcPr>
+            <w:tcW w:type="dxa" w:w="5760"/>
+            <w:shd w:val="clear" w:color="auto" w:fill="F0F4FA"/>
+          </w:tcPr>
+          <w:p>
+            <w:r>
+              <w:rPr>
+                <w:rFonts w:ascii="Calibri" w:hAnsi="Calibri"/>
+                <w:sz w:val="20"/>
+              </w:rPr>
+              <w:t>7 (golden pairs + invariantes estruturais)</w:t>
             </w:r>
           </w:p>
         </w:tc>
@@ -10430,7 +10494,7 @@
                 <w:rFonts w:ascii="Calibri" w:hAnsi="Calibri"/>
                 <w:sz w:val="20"/>
               </w:rPr>
-              <w:t>Roda 252 testes unitários</w:t>
+              <w:t>Roda 289 testes unitários</w:t>
             </w:r>
           </w:p>
         </w:tc>

</xml_diff>